<commit_message>
tidying up files for archiving
</commit_message>
<xml_diff>
--- a/docs/Evidence_use_systematic_map_MS_final.docx
+++ b/docs/Evidence_use_systematic_map_MS_final.docx
@@ -1411,6 +1411,9 @@
       <w:r>
         <w:t xml:space="preserve"> studies were retained for synthesis (Figure S1).</w:t>
       </w:r>
+      <w:r>
+        <w:t xml:space="preserve"> A list of the studies used in the systematic map are provided in the Data sources section.</w:t>
+      </w:r>
     </w:p>
     <w:p>
       <w:pPr>
@@ -1467,78 +1470,6 @@
     <w:p>
       <w:pPr>
         <w:spacing w:line="480" w:lineRule="auto"/>
-      </w:pPr>
-      <w:r>
-        <w:t xml:space="preserve">To categorise the factors influencing the use of scientific evidence in conservation we adapted the typology of Walsh et al </w:t>
-      </w:r>
-      <w:r>
-        <w:fldChar w:fldCharType="begin" w:fldLock="1"/>
-      </w:r>
-      <w:r>
-        <w:instrText>ADDIN paperpile_citation &lt;clusterId&gt;B835I282E673B386&lt;/clusterId&gt;&lt;metadata&gt;&lt;citation&gt;&lt;id&gt;f49745df-1f14-42ee-a9ad-d1faf114f2e4&lt;/id&gt;&lt;no_author&gt;true&lt;/no_author&gt;&lt;/citation&gt;&lt;/metadata&gt;&lt;data&gt;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&lt;/data&gt; \* MERGEFORMAT</w:instrText>
-      </w:r>
-      <w:r>
-        <w:fldChar w:fldCharType="separate"/>
-      </w:r>
-      <w:r>
-        <w:rPr>
-          <w:noProof/>
-        </w:rPr>
-        <w:t>(2019)</w:t>
-      </w:r>
-      <w:r>
-        <w:fldChar w:fldCharType="end"/>
-      </w:r>
-      <w:r>
-        <w:t>. This typology groups factors influencing the use of scientific evidence into: (</w:t>
-      </w:r>
-      <w:proofErr w:type="spellStart"/>
-      <w:r>
-        <w:t>i</w:t>
-      </w:r>
-      <w:proofErr w:type="spellEnd"/>
-      <w:r>
-        <w:t xml:space="preserve">) the nature of the evidence itself, (ii) research-practice links; (iii) decision contexts; (iv) researchers and research organisations; (v) practitioners; (vi) </w:t>
-      </w:r>
-      <w:r>
-        <w:lastRenderedPageBreak/>
-        <w:t>management organisations; (vii) other stakeholders; and (viii) the wider community. To aid with communication, we simplified this to four categories (see Table 1): (</w:t>
-      </w:r>
-      <w:proofErr w:type="spellStart"/>
-      <w:r>
-        <w:t>i</w:t>
-      </w:r>
-      <w:proofErr w:type="spellEnd"/>
-      <w:r>
-        <w:t xml:space="preserve">) evidence characteristics, including factors such as the existence of evidence, how accessible the evidence is, how relevant the evidence is; (ii) relationships, such as those between scientists and practitioners/policymakers or those between colleagues; (iii) researchers and research organisations, including academic demands on researchers or their skills and awareness of practice and policy; and (iv) practitioners/policymakers, organisations, and decision contexts, such as capacity and resources of organisations such as staff, time, and funding, the research skills of practitioners/policymakers, and their attitude towards evidence use. We also reduced the 230 factors identified by </w:t>
-      </w:r>
-      <w:r>
-        <w:t xml:space="preserve">Walsh et al </w:t>
-      </w:r>
-      <w:r>
-        <w:fldChar w:fldCharType="begin" w:fldLock="1"/>
-      </w:r>
-      <w:r>
-        <w:instrText>ADDIN paperpile_citation &lt;clusterId&gt;P187D264S854X558&lt;/clusterId&gt;&lt;metadata&gt;&lt;citation&gt;&lt;id&gt;f49745df-1f14-42ee-a9ad-d1faf114f2e4&lt;/id&gt;&lt;no_author&gt;true&lt;/no_author&gt;&lt;/citation&gt;&lt;/metadata&gt;&lt;data&gt;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&lt;/data&gt; \* MERGEFORMAT</w:instrText>
-      </w:r>
-      <w:r>
-        <w:fldChar w:fldCharType="separate"/>
-      </w:r>
-      <w:r>
-        <w:rPr>
-          <w:noProof/>
-        </w:rPr>
-        <w:t>(2019)</w:t>
-      </w:r>
-      <w:r>
-        <w:fldChar w:fldCharType="end"/>
-      </w:r>
-      <w:r>
-        <w:t xml:space="preserve">, to 35 more broadly-defined factors. This involved rephrasing the factors so that they were neutral, rather than identified as barriers or facilitators. This aided more reproducible identification and classification of factors identified in primary studies by members of the review team. </w:t>
-      </w:r>
-    </w:p>
-    <w:p>
-      <w:pPr>
         <w:sectPr>
           <w:headerReference w:type="default" r:id="rId9"/>
           <w:pgSz w:w="11909" w:h="16834"/>
@@ -1549,6 +1480,77 @@
           <w:titlePg/>
         </w:sectPr>
       </w:pPr>
+      <w:r>
+        <w:t xml:space="preserve">To categorise the factors influencing the use of scientific evidence in conservation we adapted the typology of Walsh et al </w:t>
+      </w:r>
+      <w:r>
+        <w:fldChar w:fldCharType="begin" w:fldLock="1"/>
+      </w:r>
+      <w:r>
+        <w:instrText>ADDIN paperpile_citation &lt;clusterId&gt;B835I282E673B386&lt;/clusterId&gt;&lt;metadata&gt;&lt;citation&gt;&lt;id&gt;f49745df-1f14-42ee-a9ad-d1faf114f2e4&lt;/id&gt;&lt;no_author&gt;true&lt;/no_author&gt;&lt;/citation&gt;&lt;/metadata&gt;&lt;data&gt;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&lt;/data&gt; \* MERGEFORMAT</w:instrText>
+      </w:r>
+      <w:r>
+        <w:fldChar w:fldCharType="separate"/>
+      </w:r>
+      <w:r>
+        <w:rPr>
+          <w:noProof/>
+        </w:rPr>
+        <w:t>(2019)</w:t>
+      </w:r>
+      <w:r>
+        <w:fldChar w:fldCharType="end"/>
+      </w:r>
+      <w:r>
+        <w:t>. This typology groups factors influencing the use of scientific evidence into: (</w:t>
+      </w:r>
+      <w:proofErr w:type="spellStart"/>
+      <w:r>
+        <w:t>i</w:t>
+      </w:r>
+      <w:proofErr w:type="spellEnd"/>
+      <w:r>
+        <w:t xml:space="preserve">) the nature of the evidence itself, (ii) research-practice links; (iii) </w:t>
+      </w:r>
+      <w:r>
+        <w:lastRenderedPageBreak/>
+        <w:t>decision contexts; (iv) researchers and research organisations; (v) practitioners; (vi) management organisations; (vii) other stakeholders; and (viii) the wider community. To aid with communication, we simplified this to four categories (see Table 1): (</w:t>
+      </w:r>
+      <w:proofErr w:type="spellStart"/>
+      <w:r>
+        <w:t>i</w:t>
+      </w:r>
+      <w:proofErr w:type="spellEnd"/>
+      <w:r>
+        <w:t xml:space="preserve">) evidence characteristics, including factors such as the existence of evidence, how accessible the evidence is, how relevant the evidence is; (ii) relationships, such as those between scientists and practitioners/policymakers or those between colleagues; (iii) researchers and research organisations, including academic demands on researchers or their skills and awareness of practice and policy; and (iv) practitioners/policymakers, organisations, and decision contexts, such as capacity and resources of organisations such as staff, time, and funding, the research skills of practitioners/policymakers, and their attitude towards evidence use. We also reduced the 230 factors identified by </w:t>
+      </w:r>
+      <w:r>
+        <w:t xml:space="preserve">Walsh et al </w:t>
+      </w:r>
+      <w:r>
+        <w:fldChar w:fldCharType="begin" w:fldLock="1"/>
+      </w:r>
+      <w:r>
+        <w:instrText>ADDIN paperpile_citation &lt;clusterId&gt;P187D264S854X558&lt;/clusterId&gt;&lt;metadata&gt;&lt;citation&gt;&lt;id&gt;f49745df-1f14-42ee-a9ad-d1faf114f2e4&lt;/id&gt;&lt;no_author&gt;true&lt;/no_author&gt;&lt;/citation&gt;&lt;/metadata&gt;&lt;data&gt;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&lt;/data&gt; \* MERGEFORMAT</w:instrText>
+      </w:r>
+      <w:r>
+        <w:fldChar w:fldCharType="separate"/>
+      </w:r>
+      <w:r>
+        <w:rPr>
+          <w:noProof/>
+        </w:rPr>
+        <w:t>(2019)</w:t>
+      </w:r>
+      <w:r>
+        <w:fldChar w:fldCharType="end"/>
+      </w:r>
+      <w:r>
+        <w:t>, to 35 more broadly-defined factors. This involved rephrasing the factors so that they were neutral, rather than identified as barriers or facilitators. This aided more reproducible identification and classification of factors identified in primary studies by members of the review team.</w:t>
+      </w:r>
+      <w:r>
+        <w:t xml:space="preserve"> Since we did not collect any new data for our study, or make use of personal data, we did not require any form of ethical approval.</w:t>
+      </w:r>
     </w:p>
     <w:p>
       <w:pPr>
@@ -12899,6 +12901,2179 @@
         <w:fldChar w:fldCharType="end"/>
       </w:r>
     </w:p>
+    <w:p>
+      <w:pPr>
+        <w:widowControl w:val="0"/>
+        <w:pBdr>
+          <w:top w:val="nil"/>
+          <w:left w:val="nil"/>
+          <w:bottom w:val="nil"/>
+          <w:right w:val="nil"/>
+          <w:between w:val="nil"/>
+        </w:pBdr>
+        <w:spacing w:line="480" w:lineRule="auto"/>
+      </w:pPr>
+    </w:p>
+    <w:p>
+      <w:pPr>
+        <w:widowControl w:val="0"/>
+        <w:pBdr>
+          <w:top w:val="nil"/>
+          <w:left w:val="nil"/>
+          <w:bottom w:val="nil"/>
+          <w:right w:val="nil"/>
+          <w:between w:val="nil"/>
+        </w:pBdr>
+        <w:spacing w:line="480" w:lineRule="auto"/>
+        <w:rPr>
+          <w:b/>
+          <w:bCs/>
+        </w:rPr>
+      </w:pPr>
+      <w:r>
+        <w:rPr>
+          <w:b/>
+          <w:bCs/>
+        </w:rPr>
+        <w:t>Data sources</w:t>
+      </w:r>
+    </w:p>
+    <w:p>
+      <w:pPr>
+        <w:spacing w:line="480" w:lineRule="auto"/>
+      </w:pPr>
+      <w:r>
+        <w:t xml:space="preserve">Ainsworth, G. B., Redpath, S. M., Wilson, M., </w:t>
+      </w:r>
+      <w:proofErr w:type="spellStart"/>
+      <w:r>
+        <w:t>Wernham</w:t>
+      </w:r>
+      <w:proofErr w:type="spellEnd"/>
+      <w:r>
+        <w:t xml:space="preserve">, C., &amp; Young, J. C. (2020). Integrating scientific and local knowledge to address conservation conflicts: Towards a practical framework based on lessons learned from a Scottish case study. </w:t>
+      </w:r>
+      <w:r>
+        <w:rPr>
+          <w:i/>
+          <w:iCs/>
+        </w:rPr>
+        <w:t>Environmental Science &amp; Policy</w:t>
+      </w:r>
+      <w:r>
+        <w:t xml:space="preserve">, </w:t>
+      </w:r>
+      <w:r>
+        <w:rPr>
+          <w:i/>
+          <w:iCs/>
+        </w:rPr>
+        <w:t>107</w:t>
+      </w:r>
+      <w:r>
+        <w:t>, 46–55. https://doi.org/10.1016/j.envsci.2020.02.017</w:t>
+      </w:r>
+      <w:r>
+        <w:br/>
+      </w:r>
+      <w:r>
+        <w:lastRenderedPageBreak/>
+        <w:t xml:space="preserve">Arias, M., </w:t>
+      </w:r>
+      <w:proofErr w:type="spellStart"/>
+      <w:r>
+        <w:t>Hinsley</w:t>
+      </w:r>
+      <w:proofErr w:type="spellEnd"/>
+      <w:r>
+        <w:t xml:space="preserve">, A., &amp; Milner-Gulland, E. J. (2021). Use of evidence for decision-making by conservation practitioners in the illegal wildlife trade. </w:t>
+      </w:r>
+      <w:r>
+        <w:rPr>
+          <w:i/>
+          <w:iCs/>
+        </w:rPr>
+        <w:t>People and Nature</w:t>
+      </w:r>
+      <w:r>
+        <w:t xml:space="preserve">, </w:t>
+      </w:r>
+      <w:r>
+        <w:rPr>
+          <w:i/>
+          <w:iCs/>
+        </w:rPr>
+        <w:t>3</w:t>
+      </w:r>
+      <w:r>
+        <w:t>(5), 1110–1126. https://doi.org/10.1002/pan3.10258</w:t>
+      </w:r>
+      <w:r>
+        <w:br/>
+        <w:t xml:space="preserve">Coll, M., </w:t>
+      </w:r>
+      <w:proofErr w:type="spellStart"/>
+      <w:r>
+        <w:t>Cury</w:t>
+      </w:r>
+      <w:proofErr w:type="spellEnd"/>
+      <w:r>
+        <w:t xml:space="preserve">, P., Azzurro, E., </w:t>
+      </w:r>
+      <w:proofErr w:type="spellStart"/>
+      <w:r>
+        <w:t>Bariche</w:t>
+      </w:r>
+      <w:proofErr w:type="spellEnd"/>
+      <w:r>
+        <w:t xml:space="preserve">, M., </w:t>
+      </w:r>
+      <w:proofErr w:type="spellStart"/>
+      <w:r>
+        <w:t>Bayadas</w:t>
+      </w:r>
+      <w:proofErr w:type="spellEnd"/>
+      <w:r>
+        <w:t xml:space="preserve">, G., </w:t>
+      </w:r>
+      <w:proofErr w:type="spellStart"/>
+      <w:r>
+        <w:t>Bellido</w:t>
+      </w:r>
+      <w:proofErr w:type="spellEnd"/>
+      <w:r>
+        <w:t xml:space="preserve">, J. M., </w:t>
+      </w:r>
+      <w:proofErr w:type="spellStart"/>
+      <w:r>
+        <w:t>Chaboud</w:t>
+      </w:r>
+      <w:proofErr w:type="spellEnd"/>
+      <w:r>
+        <w:t xml:space="preserve">, C., Claudet, J., El-Sayed, A.-F., </w:t>
+      </w:r>
+      <w:proofErr w:type="spellStart"/>
+      <w:r>
+        <w:t>Gascuel</w:t>
+      </w:r>
+      <w:proofErr w:type="spellEnd"/>
+      <w:r>
+        <w:t xml:space="preserve">, D., </w:t>
+      </w:r>
+      <w:proofErr w:type="spellStart"/>
+      <w:r>
+        <w:t>Knittweis</w:t>
+      </w:r>
+      <w:proofErr w:type="spellEnd"/>
+      <w:r>
+        <w:t xml:space="preserve">, L., </w:t>
+      </w:r>
+      <w:proofErr w:type="spellStart"/>
+      <w:r>
+        <w:t>Pipitone</w:t>
+      </w:r>
+      <w:proofErr w:type="spellEnd"/>
+      <w:r>
+        <w:t xml:space="preserve">, C., Samuel-Rhoads, Y., </w:t>
+      </w:r>
+      <w:proofErr w:type="spellStart"/>
+      <w:r>
+        <w:t>Taleb</w:t>
+      </w:r>
+      <w:proofErr w:type="spellEnd"/>
+      <w:r>
+        <w:t xml:space="preserve">, S., </w:t>
+      </w:r>
+      <w:proofErr w:type="spellStart"/>
+      <w:r>
+        <w:t>Tudela</w:t>
+      </w:r>
+      <w:proofErr w:type="spellEnd"/>
+      <w:r>
+        <w:t xml:space="preserve">, S., &amp; Valls, A. (2013). The scientific strategy needed to promote a regional ecosystem-based approach to fisheries in the Mediterranean and Black Seas. </w:t>
+      </w:r>
+      <w:r>
+        <w:rPr>
+          <w:i/>
+          <w:iCs/>
+        </w:rPr>
+        <w:t>Reviews in Fish Biology and Fisheries</w:t>
+      </w:r>
+      <w:r>
+        <w:t xml:space="preserve">, </w:t>
+      </w:r>
+      <w:r>
+        <w:rPr>
+          <w:i/>
+          <w:iCs/>
+        </w:rPr>
+        <w:t>23</w:t>
+      </w:r>
+      <w:r>
+        <w:t>(4), 415–434. https://doi.org/10.1007/s11160-013-9305-y</w:t>
+      </w:r>
+      <w:r>
+        <w:br/>
+        <w:t xml:space="preserve">Cook, C. N., &amp; </w:t>
+      </w:r>
+      <w:proofErr w:type="spellStart"/>
+      <w:r>
+        <w:t>Sgrò</w:t>
+      </w:r>
+      <w:proofErr w:type="spellEnd"/>
+      <w:r>
+        <w:t xml:space="preserve">, C. M. (2019). Poor understanding of evolutionary theory is a barrier to effective conservation management. </w:t>
+      </w:r>
+      <w:r>
+        <w:rPr>
+          <w:i/>
+          <w:iCs/>
+        </w:rPr>
+        <w:t>Conservation Letters</w:t>
+      </w:r>
+      <w:r>
+        <w:t xml:space="preserve">, </w:t>
+      </w:r>
+      <w:r>
+        <w:rPr>
+          <w:i/>
+          <w:iCs/>
+        </w:rPr>
+        <w:t>12</w:t>
+      </w:r>
+      <w:r>
+        <w:t>(2). https://doi.org/10.1111/conl.12619</w:t>
+      </w:r>
+      <w:r>
+        <w:br/>
+        <w:t xml:space="preserve">Cooke, S. J., Nguyen, V. M., Wilson, A. D. M., Donaldson, M. R., Gallagher, A. J., </w:t>
+      </w:r>
+      <w:proofErr w:type="spellStart"/>
+      <w:r>
+        <w:t>Hammerschlag</w:t>
+      </w:r>
+      <w:proofErr w:type="spellEnd"/>
+      <w:r>
+        <w:t xml:space="preserve">, N., &amp; </w:t>
+      </w:r>
+      <w:proofErr w:type="spellStart"/>
+      <w:r>
+        <w:t>Haddaway</w:t>
+      </w:r>
+      <w:proofErr w:type="spellEnd"/>
+      <w:r>
+        <w:t xml:space="preserve">, N. R. (2016). The need for speed in a crisis discipline: perspectives on peer-review duration and implications for conservation science. </w:t>
+      </w:r>
+      <w:r>
+        <w:rPr>
+          <w:i/>
+          <w:iCs/>
+        </w:rPr>
+        <w:t>Endangered Species Research</w:t>
+      </w:r>
+      <w:r>
+        <w:t xml:space="preserve">, </w:t>
+      </w:r>
+      <w:r>
+        <w:rPr>
+          <w:i/>
+          <w:iCs/>
+        </w:rPr>
+        <w:t>30</w:t>
+      </w:r>
+      <w:r>
+        <w:t>, 43405. https://doi.org/10.3354/esr00721</w:t>
+      </w:r>
+      <w:r>
+        <w:br/>
+      </w:r>
+      <w:proofErr w:type="spellStart"/>
+      <w:r>
+        <w:t>Cvitanovic</w:t>
+      </w:r>
+      <w:proofErr w:type="spellEnd"/>
+      <w:r>
+        <w:t xml:space="preserve">, C., Mackay, M., </w:t>
+      </w:r>
+      <w:proofErr w:type="spellStart"/>
+      <w:r>
+        <w:t>Shellock</w:t>
+      </w:r>
+      <w:proofErr w:type="spellEnd"/>
+      <w:r>
+        <w:t xml:space="preserve">, R. J., van </w:t>
+      </w:r>
+      <w:proofErr w:type="spellStart"/>
+      <w:r>
+        <w:t>Putten</w:t>
+      </w:r>
+      <w:proofErr w:type="spellEnd"/>
+      <w:r>
+        <w:t xml:space="preserve">, E. I., </w:t>
+      </w:r>
+      <w:proofErr w:type="spellStart"/>
+      <w:r>
+        <w:t>Karcher</w:t>
+      </w:r>
+      <w:proofErr w:type="spellEnd"/>
+      <w:r>
+        <w:t>, D. B., &amp; Dickey-</w:t>
+      </w:r>
+      <w:proofErr w:type="spellStart"/>
+      <w:r>
+        <w:t>Collas</w:t>
+      </w:r>
+      <w:proofErr w:type="spellEnd"/>
+      <w:r>
+        <w:t xml:space="preserve">, M. (2021). Understanding and evidencing a broader range of successes that can occur at the interface of marine science and policy. </w:t>
+      </w:r>
+      <w:r>
+        <w:rPr>
+          <w:i/>
+          <w:iCs/>
+        </w:rPr>
+        <w:t>Marine Policy</w:t>
+      </w:r>
+      <w:r>
+        <w:t xml:space="preserve">, </w:t>
+      </w:r>
+      <w:r>
+        <w:rPr>
+          <w:i/>
+          <w:iCs/>
+        </w:rPr>
+        <w:t>134</w:t>
+      </w:r>
+      <w:r>
+        <w:t>. https://doi.org/10.1016/j.marpol.2021.104802</w:t>
+      </w:r>
+      <w:r>
+        <w:br/>
+      </w:r>
+      <w:proofErr w:type="spellStart"/>
+      <w:r>
+        <w:t>Cvitanovic</w:t>
+      </w:r>
+      <w:proofErr w:type="spellEnd"/>
+      <w:r>
+        <w:t xml:space="preserve">, C., </w:t>
+      </w:r>
+      <w:proofErr w:type="spellStart"/>
+      <w:r>
+        <w:t>Shellock</w:t>
+      </w:r>
+      <w:proofErr w:type="spellEnd"/>
+      <w:r>
+        <w:t xml:space="preserve">, R. J., Mackay, M., Van, P. E. I., </w:t>
+      </w:r>
+      <w:proofErr w:type="spellStart"/>
+      <w:r>
+        <w:t>Karcher</w:t>
+      </w:r>
+      <w:proofErr w:type="spellEnd"/>
+      <w:r>
+        <w:t>, D. B., Dickey-</w:t>
+      </w:r>
+      <w:proofErr w:type="spellStart"/>
+      <w:r>
+        <w:t>Collas</w:t>
+      </w:r>
+      <w:proofErr w:type="spellEnd"/>
+      <w:r>
+        <w:t xml:space="preserve">, M., &amp; Ballesteros, M. (2021). Strategies for building and managing “trust” to enable knowledge exchange at the interface of environmental science and policy. </w:t>
+      </w:r>
+      <w:r>
+        <w:rPr>
+          <w:i/>
+          <w:iCs/>
+        </w:rPr>
+        <w:t>Environmental Science &amp; Policy</w:t>
+      </w:r>
+      <w:r>
+        <w:t xml:space="preserve">, </w:t>
+      </w:r>
+      <w:r>
+        <w:rPr>
+          <w:i/>
+          <w:iCs/>
+        </w:rPr>
+        <w:t>123</w:t>
+      </w:r>
+      <w:r>
+        <w:t>, 179–189.</w:t>
+      </w:r>
+      <w:r>
+        <w:br/>
+        <w:t xml:space="preserve">Davies, A. L., Colombo, S., &amp; Hanley, N. (2014). Improving the application of long-term ecology in conservation and land management. </w:t>
+      </w:r>
+      <w:r>
+        <w:rPr>
+          <w:i/>
+          <w:iCs/>
+        </w:rPr>
+        <w:t>The Journal of Applied Ecology</w:t>
+      </w:r>
+      <w:r>
+        <w:t xml:space="preserve">, </w:t>
+      </w:r>
+      <w:r>
+        <w:rPr>
+          <w:i/>
+          <w:iCs/>
+        </w:rPr>
+        <w:t>51</w:t>
+      </w:r>
+      <w:r>
+        <w:t>(1), 63–70. https://doi.org/10.1111/1365-2664.12163</w:t>
+      </w:r>
+      <w:r>
+        <w:br/>
+        <w:t xml:space="preserve">Denny, S., &amp; Fanning, L. (2016). Balancing community autonomy with collective identity: Mi’kmaq decision-making in Nova Scotia. </w:t>
+      </w:r>
+      <w:r>
+        <w:rPr>
+          <w:i/>
+          <w:iCs/>
+        </w:rPr>
+        <w:t>The Canadian Journal of Native Studies</w:t>
+      </w:r>
+      <w:r>
+        <w:t xml:space="preserve">, </w:t>
+      </w:r>
+      <w:r>
+        <w:rPr>
+          <w:i/>
+          <w:iCs/>
+        </w:rPr>
+        <w:t>36</w:t>
+      </w:r>
+      <w:r>
+        <w:t xml:space="preserve">(2), </w:t>
+      </w:r>
+      <w:r>
+        <w:lastRenderedPageBreak/>
+        <w:t>81–106.</w:t>
+      </w:r>
+      <w:r>
+        <w:br/>
+      </w:r>
+      <w:proofErr w:type="spellStart"/>
+      <w:r>
+        <w:t>Dharmawan</w:t>
+      </w:r>
+      <w:proofErr w:type="spellEnd"/>
+      <w:r>
+        <w:t xml:space="preserve">, B., </w:t>
+      </w:r>
+      <w:proofErr w:type="spellStart"/>
+      <w:r>
+        <w:t>Böcher</w:t>
+      </w:r>
+      <w:proofErr w:type="spellEnd"/>
+      <w:r>
+        <w:t xml:space="preserve">, M., &amp; </w:t>
+      </w:r>
+      <w:proofErr w:type="spellStart"/>
+      <w:r>
+        <w:t>Krott</w:t>
+      </w:r>
+      <w:proofErr w:type="spellEnd"/>
+      <w:r>
+        <w:t xml:space="preserve">, M. (2017). Endangered Mangroves in </w:t>
+      </w:r>
+      <w:proofErr w:type="spellStart"/>
+      <w:r>
+        <w:t>Segara</w:t>
+      </w:r>
+      <w:proofErr w:type="spellEnd"/>
+      <w:r>
+        <w:t xml:space="preserve"> </w:t>
+      </w:r>
+      <w:proofErr w:type="spellStart"/>
+      <w:r>
+        <w:t>Anakan</w:t>
+      </w:r>
+      <w:proofErr w:type="spellEnd"/>
+      <w:r>
+        <w:t xml:space="preserve">, Indonesia: Effective and Failed Problem-Solving Policy Advice. </w:t>
+      </w:r>
+      <w:r>
+        <w:rPr>
+          <w:i/>
+          <w:iCs/>
+        </w:rPr>
+        <w:t>Environmental Management</w:t>
+      </w:r>
+      <w:r>
+        <w:t xml:space="preserve">, </w:t>
+      </w:r>
+      <w:r>
+        <w:rPr>
+          <w:i/>
+          <w:iCs/>
+        </w:rPr>
+        <w:t>60</w:t>
+      </w:r>
+      <w:r>
+        <w:t>(3), 409–421. https://doi.org/10.1007/s00267-017-0868-6</w:t>
+      </w:r>
+      <w:r>
+        <w:br/>
+      </w:r>
+      <w:proofErr w:type="spellStart"/>
+      <w:r>
+        <w:t>Eschen</w:t>
+      </w:r>
+      <w:proofErr w:type="spellEnd"/>
+      <w:r>
+        <w:t xml:space="preserve">, R., </w:t>
+      </w:r>
+      <w:proofErr w:type="spellStart"/>
+      <w:r>
+        <w:t>Mbaabu</w:t>
+      </w:r>
+      <w:proofErr w:type="spellEnd"/>
+      <w:r>
+        <w:t xml:space="preserve">, P. R., </w:t>
+      </w:r>
+      <w:proofErr w:type="spellStart"/>
+      <w:r>
+        <w:t>Ramamonjisoa</w:t>
+      </w:r>
+      <w:proofErr w:type="spellEnd"/>
+      <w:r>
+        <w:t xml:space="preserve">, B. S., &amp; Robledo-Abad, C. (2021). Factors enhancing the level of utilisation of research knowledge on ecosystems. </w:t>
+      </w:r>
+      <w:proofErr w:type="spellStart"/>
+      <w:r>
+        <w:rPr>
+          <w:i/>
+          <w:iCs/>
+        </w:rPr>
+        <w:t>PloS</w:t>
+      </w:r>
+      <w:proofErr w:type="spellEnd"/>
+      <w:r>
+        <w:rPr>
+          <w:i/>
+          <w:iCs/>
+        </w:rPr>
+        <w:t xml:space="preserve"> One</w:t>
+      </w:r>
+      <w:r>
+        <w:t xml:space="preserve">, </w:t>
+      </w:r>
+      <w:r>
+        <w:rPr>
+          <w:i/>
+          <w:iCs/>
+        </w:rPr>
+        <w:t>16</w:t>
+      </w:r>
+      <w:r>
+        <w:t>(7). https://doi.org/10.1371/journal.pone.0254752</w:t>
+      </w:r>
+      <w:r>
+        <w:br/>
+        <w:t xml:space="preserve">Ferré, M., Martin-Ortega, J., Di Gregorio, M., &amp; </w:t>
+      </w:r>
+      <w:proofErr w:type="spellStart"/>
+      <w:r>
+        <w:t>Dallimer</w:t>
+      </w:r>
+      <w:proofErr w:type="spellEnd"/>
+      <w:r>
+        <w:t xml:space="preserve">, M. (2022). How do information flows affect impact from environmental research?-An analysis of a science-policy network. </w:t>
+      </w:r>
+      <w:r>
+        <w:rPr>
+          <w:i/>
+          <w:iCs/>
+        </w:rPr>
+        <w:t>Journal of Environmental Management</w:t>
+      </w:r>
+      <w:r>
+        <w:t xml:space="preserve">, </w:t>
+      </w:r>
+      <w:r>
+        <w:rPr>
+          <w:i/>
+          <w:iCs/>
+        </w:rPr>
+        <w:t>321</w:t>
+      </w:r>
+      <w:r>
+        <w:t>. https://doi.org/10.1016/j.jenvman.2022.115828</w:t>
+      </w:r>
+      <w:r>
+        <w:br/>
+        <w:t xml:space="preserve">Foster, C. N., O’Loughlin, L. S., Sato, C. F., Westgate, M. J., Barton, P. S., Pierson, J. C., Balmer, J. M., Catt, G., Chapman, J., </w:t>
+      </w:r>
+      <w:proofErr w:type="spellStart"/>
+      <w:r>
+        <w:t>Detto</w:t>
+      </w:r>
+      <w:proofErr w:type="spellEnd"/>
+      <w:r>
+        <w:t xml:space="preserve">, T., </w:t>
+      </w:r>
+      <w:proofErr w:type="spellStart"/>
+      <w:r>
+        <w:t>Hawcroft</w:t>
+      </w:r>
+      <w:proofErr w:type="spellEnd"/>
+      <w:r>
+        <w:t xml:space="preserve">, A., Jones, G., Kavanagh, R. P., McKay, M., Marshall, D., </w:t>
+      </w:r>
+      <w:proofErr w:type="spellStart"/>
+      <w:r>
+        <w:t>Moseby</w:t>
+      </w:r>
+      <w:proofErr w:type="spellEnd"/>
+      <w:r>
+        <w:t xml:space="preserve">, K. E., Perry, M., Robinson, D., Seddon, J. A., … </w:t>
+      </w:r>
+      <w:proofErr w:type="spellStart"/>
+      <w:r>
+        <w:t>Lindenmayer</w:t>
+      </w:r>
+      <w:proofErr w:type="spellEnd"/>
+      <w:r>
+        <w:t xml:space="preserve">, D. B. (2019). How practitioners integrate decision triggers with existing metrics in conservation monitoring. </w:t>
+      </w:r>
+      <w:r>
+        <w:rPr>
+          <w:i/>
+          <w:iCs/>
+        </w:rPr>
+        <w:t>Journal of Environmental Management</w:t>
+      </w:r>
+      <w:r>
+        <w:t xml:space="preserve">, </w:t>
+      </w:r>
+      <w:r>
+        <w:rPr>
+          <w:i/>
+          <w:iCs/>
+        </w:rPr>
+        <w:t>230</w:t>
+      </w:r>
+      <w:r>
+        <w:t>, 94–101. https://doi.org/10.1016/j.jenvman.2018.09.067</w:t>
+      </w:r>
+      <w:r>
+        <w:br/>
+      </w:r>
+      <w:proofErr w:type="spellStart"/>
+      <w:r>
+        <w:t>Gagné</w:t>
+      </w:r>
+      <w:proofErr w:type="spellEnd"/>
+      <w:r>
+        <w:t>, S. A., Bryan-</w:t>
+      </w:r>
+      <w:proofErr w:type="spellStart"/>
+      <w:r>
+        <w:t>Scaggs</w:t>
+      </w:r>
+      <w:proofErr w:type="spellEnd"/>
+      <w:r>
+        <w:t xml:space="preserve">, K., Boyer, R. H. W., &amp; Xiang, W. N. (2020). Conserving biodiversity takes a plan: How planners implement ecological information for biodiversity conservation. </w:t>
+      </w:r>
+      <w:proofErr w:type="spellStart"/>
+      <w:r>
+        <w:rPr>
+          <w:i/>
+          <w:iCs/>
+        </w:rPr>
+        <w:t>Ambio</w:t>
+      </w:r>
+      <w:proofErr w:type="spellEnd"/>
+      <w:r>
+        <w:t xml:space="preserve">, </w:t>
+      </w:r>
+      <w:r>
+        <w:rPr>
+          <w:i/>
+          <w:iCs/>
+        </w:rPr>
+        <w:t>49</w:t>
+      </w:r>
+      <w:r>
+        <w:t>(9), 1490–1505. https://doi.org/10.1007/s13280-019-01281-z</w:t>
+      </w:r>
+      <w:r>
+        <w:br/>
+        <w:t xml:space="preserve">Gardiner, N. B., Liggett, D., Gilbert, N., &amp; </w:t>
+      </w:r>
+      <w:proofErr w:type="spellStart"/>
+      <w:r>
+        <w:t>Cvitanovic</w:t>
+      </w:r>
+      <w:proofErr w:type="spellEnd"/>
+      <w:r>
+        <w:t xml:space="preserve">, C. (2024). Practitioners’ perspectives on the enablers and barriers to successful Antarctic science-policy knowledge exchange. </w:t>
+      </w:r>
+      <w:r>
+        <w:rPr>
+          <w:i/>
+          <w:iCs/>
+        </w:rPr>
+        <w:t>Environmental Policy and Governance</w:t>
+      </w:r>
+      <w:r>
+        <w:t>. https://doi.org/10.1002/eet.2143</w:t>
+      </w:r>
+      <w:r>
+        <w:br/>
+      </w:r>
+      <w:proofErr w:type="spellStart"/>
+      <w:r>
+        <w:t>Giebels</w:t>
+      </w:r>
+      <w:proofErr w:type="spellEnd"/>
+      <w:r>
+        <w:t xml:space="preserve">, D., van </w:t>
+      </w:r>
+      <w:proofErr w:type="spellStart"/>
+      <w:r>
+        <w:t>Buuren</w:t>
+      </w:r>
+      <w:proofErr w:type="spellEnd"/>
+      <w:r>
+        <w:t xml:space="preserve">, A., &amp; </w:t>
+      </w:r>
+      <w:proofErr w:type="spellStart"/>
+      <w:r>
+        <w:t>Edelenbos</w:t>
+      </w:r>
+      <w:proofErr w:type="spellEnd"/>
+      <w:r>
+        <w:t xml:space="preserve">, J. (2015). Using knowledge in a complex decision-making process - Evidence and principles from the Danish Houting project’s ecosystem-based management approach. </w:t>
+      </w:r>
+      <w:r>
+        <w:rPr>
+          <w:i/>
+          <w:iCs/>
+        </w:rPr>
+        <w:t>Environmental Science &amp; Policy</w:t>
+      </w:r>
+      <w:r>
+        <w:t xml:space="preserve">, </w:t>
+      </w:r>
+      <w:r>
+        <w:rPr>
+          <w:i/>
+          <w:iCs/>
+        </w:rPr>
+        <w:t>47</w:t>
+      </w:r>
+      <w:r>
+        <w:t>, 53–67. https://doi.org/10.1016/j.envsci.2014.10.015</w:t>
+      </w:r>
+      <w:r>
+        <w:br/>
+      </w:r>
+      <w:proofErr w:type="spellStart"/>
+      <w:r>
+        <w:t>Giehl</w:t>
+      </w:r>
+      <w:proofErr w:type="spellEnd"/>
+      <w:r>
+        <w:t xml:space="preserve">, E. L. H., Moretti, M., Walsh, J. C., </w:t>
+      </w:r>
+      <w:proofErr w:type="spellStart"/>
+      <w:r>
+        <w:t>Batalha</w:t>
+      </w:r>
+      <w:proofErr w:type="spellEnd"/>
+      <w:r>
+        <w:t xml:space="preserve">, M. A., &amp; Cook, C. N. (2017). Scientific evidence and potential barriers in the management of Brazilian protected areas. </w:t>
+      </w:r>
+      <w:proofErr w:type="spellStart"/>
+      <w:r>
+        <w:rPr>
+          <w:i/>
+          <w:iCs/>
+        </w:rPr>
+        <w:t>PloS</w:t>
+      </w:r>
+      <w:proofErr w:type="spellEnd"/>
+      <w:r>
+        <w:rPr>
+          <w:i/>
+          <w:iCs/>
+        </w:rPr>
+        <w:t xml:space="preserve"> One</w:t>
+      </w:r>
+      <w:r>
+        <w:t xml:space="preserve">, </w:t>
+      </w:r>
+      <w:r>
+        <w:rPr>
+          <w:i/>
+          <w:iCs/>
+        </w:rPr>
+        <w:lastRenderedPageBreak/>
+        <w:t>12</w:t>
+      </w:r>
+      <w:r>
+        <w:t>(1). https://doi.org/10.1371/journal.pone.0169917</w:t>
+      </w:r>
+      <w:r>
+        <w:br/>
+        <w:t xml:space="preserve">Goggin, C. L., Barrett, T., Leys, J., </w:t>
+      </w:r>
+      <w:proofErr w:type="spellStart"/>
+      <w:r>
+        <w:t>Summerell</w:t>
+      </w:r>
+      <w:proofErr w:type="spellEnd"/>
+      <w:r>
+        <w:t xml:space="preserve">, G., </w:t>
+      </w:r>
+      <w:proofErr w:type="spellStart"/>
+      <w:r>
+        <w:t>Gorrod</w:t>
+      </w:r>
+      <w:proofErr w:type="spellEnd"/>
+      <w:r>
+        <w:t xml:space="preserve">, E., Waters, S., </w:t>
+      </w:r>
+      <w:proofErr w:type="spellStart"/>
+      <w:r>
+        <w:t>Littleboy</w:t>
+      </w:r>
+      <w:proofErr w:type="spellEnd"/>
+      <w:r>
+        <w:t xml:space="preserve">, M., Auld, T. D., </w:t>
+      </w:r>
+      <w:proofErr w:type="spellStart"/>
+      <w:r>
+        <w:t>Drielsma</w:t>
+      </w:r>
+      <w:proofErr w:type="spellEnd"/>
+      <w:r>
+        <w:t xml:space="preserve">, M. J., &amp; Jenkins, B. R. (2019). Incorporating social dimensions in planning, managing and evaluating environmental projects. </w:t>
+      </w:r>
+      <w:r>
+        <w:rPr>
+          <w:i/>
+          <w:iCs/>
+        </w:rPr>
+        <w:t>Environmental Management</w:t>
+      </w:r>
+      <w:r>
+        <w:t xml:space="preserve">, </w:t>
+      </w:r>
+      <w:r>
+        <w:rPr>
+          <w:i/>
+          <w:iCs/>
+        </w:rPr>
+        <w:t>63</w:t>
+      </w:r>
+      <w:r>
+        <w:t>(2), 215–232. https://doi.org/10.1007/s00267-018-01131-w</w:t>
+      </w:r>
+      <w:r>
+        <w:br/>
+        <w:t xml:space="preserve">González, A., </w:t>
+      </w:r>
+      <w:proofErr w:type="spellStart"/>
+      <w:r>
+        <w:t>Keneghan</w:t>
+      </w:r>
+      <w:proofErr w:type="spellEnd"/>
+      <w:r>
+        <w:t xml:space="preserve">, D., Fry, J., &amp; Hochstrasser, T. (2014). Current practice in biodiversity impact assessment and prospects for developing an integrated process. </w:t>
+      </w:r>
+      <w:r>
+        <w:rPr>
+          <w:i/>
+          <w:iCs/>
+        </w:rPr>
+        <w:t>Impact Assessment and Project Appraisal</w:t>
+      </w:r>
+      <w:r>
+        <w:t xml:space="preserve">, </w:t>
+      </w:r>
+      <w:r>
+        <w:rPr>
+          <w:i/>
+          <w:iCs/>
+        </w:rPr>
+        <w:t>32</w:t>
+      </w:r>
+      <w:r>
+        <w:t>(1), 31–42. https://doi.org/10.1080/14615517.2013.850839</w:t>
+      </w:r>
+      <w:r>
+        <w:br/>
+      </w:r>
+      <w:proofErr w:type="spellStart"/>
+      <w:r>
+        <w:t>Gootee</w:t>
+      </w:r>
+      <w:proofErr w:type="spellEnd"/>
+      <w:r>
+        <w:t xml:space="preserve">, R. S., </w:t>
+      </w:r>
+      <w:proofErr w:type="spellStart"/>
+      <w:r>
+        <w:t>Blatner</w:t>
+      </w:r>
+      <w:proofErr w:type="spellEnd"/>
+      <w:r>
+        <w:t xml:space="preserve">, K. A., Baumgartner, D. M., Carroll, M. S., &amp; Weber, E. P. (2010). Choosing What to Believe About Forests: Differences Between Professional and Non-Professional Evaluative Criteria. </w:t>
+      </w:r>
+      <w:r>
+        <w:rPr>
+          <w:i/>
+          <w:iCs/>
+        </w:rPr>
+        <w:t>Small Scale Forestry</w:t>
+      </w:r>
+      <w:r>
+        <w:t xml:space="preserve">, </w:t>
+      </w:r>
+      <w:r>
+        <w:rPr>
+          <w:i/>
+          <w:iCs/>
+        </w:rPr>
+        <w:t>9</w:t>
+      </w:r>
+      <w:r>
+        <w:t>(2), 137–152. https://doi.org/10.1007/s11842-010-9113-3</w:t>
+      </w:r>
+      <w:r>
+        <w:br/>
+      </w:r>
+      <w:proofErr w:type="spellStart"/>
+      <w:r>
+        <w:t>Gossa</w:t>
+      </w:r>
+      <w:proofErr w:type="spellEnd"/>
+      <w:r>
+        <w:t xml:space="preserve">, C., Fisher, M., &amp; Milner-Gulland, E. J. (2015). The research-implementation gap: How practitioners and researchers from developing countries perceive the role of peer-reviewed literature in conservation science. </w:t>
+      </w:r>
+      <w:r>
+        <w:rPr>
+          <w:i/>
+          <w:iCs/>
+        </w:rPr>
+        <w:t>Oryx: The Journal of the Fauna Preservation Society</w:t>
+      </w:r>
+      <w:r>
+        <w:t xml:space="preserve">, </w:t>
+      </w:r>
+      <w:r>
+        <w:rPr>
+          <w:i/>
+          <w:iCs/>
+        </w:rPr>
+        <w:t>49</w:t>
+      </w:r>
+      <w:r>
+        <w:t>(1), 80–87. https://doi.org/10.1017/S0030605313001634</w:t>
+      </w:r>
+      <w:r>
+        <w:br/>
+        <w:t xml:space="preserve">Grand, L., Messer, K. D., &amp; Allen, W. (2017). Understanding and Overcoming the Barriers for Cost-effective Conservation. </w:t>
+      </w:r>
+      <w:r>
+        <w:rPr>
+          <w:i/>
+          <w:iCs/>
+        </w:rPr>
+        <w:t>Ecological Economics</w:t>
+      </w:r>
+      <w:r>
+        <w:t xml:space="preserve">, </w:t>
+      </w:r>
+      <w:r>
+        <w:rPr>
+          <w:i/>
+          <w:iCs/>
+        </w:rPr>
+        <w:t>138</w:t>
+      </w:r>
+      <w:r>
+        <w:t>, 139–144. https://doi.org/10.1016/j.ecolecon.2017.03.027</w:t>
+      </w:r>
+      <w:r>
+        <w:br/>
+        <w:t xml:space="preserve">Greggor, A. L., Berger-Tal, O., </w:t>
+      </w:r>
+      <w:proofErr w:type="spellStart"/>
+      <w:r>
+        <w:t>Swaisgood</w:t>
+      </w:r>
+      <w:proofErr w:type="spellEnd"/>
+      <w:r>
+        <w:t xml:space="preserve">, R. R., Cooke, S. J., </w:t>
+      </w:r>
+      <w:proofErr w:type="spellStart"/>
+      <w:r>
+        <w:t>DeVault</w:t>
+      </w:r>
+      <w:proofErr w:type="spellEnd"/>
+      <w:r>
+        <w:t>, T. L., Fernández-</w:t>
+      </w:r>
+      <w:proofErr w:type="spellStart"/>
+      <w:r>
+        <w:t>Juricic</w:t>
+      </w:r>
+      <w:proofErr w:type="spellEnd"/>
+      <w:r>
+        <w:t xml:space="preserve">, E., Gienapp, A., Hall, S., Hostetter, C., Owen, M. A., Rankin, S., Ruppert, K. A., Swaddle, J. P., &amp; Blumstein, D. T. (2021). Using Change Models to Envision Better Applications of Animal </w:t>
+      </w:r>
+      <w:proofErr w:type="spellStart"/>
+      <w:r>
+        <w:t>Behavior</w:t>
+      </w:r>
+      <w:proofErr w:type="spellEnd"/>
+      <w:r>
+        <w:t xml:space="preserve"> Research in Conservation Management and Beyond. </w:t>
+      </w:r>
+      <w:r>
+        <w:rPr>
+          <w:i/>
+          <w:iCs/>
+        </w:rPr>
+        <w:t>Frontiers in Conservation Science</w:t>
+      </w:r>
+      <w:r>
+        <w:t xml:space="preserve">, </w:t>
+      </w:r>
+      <w:r>
+        <w:rPr>
+          <w:i/>
+          <w:iCs/>
+        </w:rPr>
+        <w:t>2</w:t>
+      </w:r>
+      <w:r>
+        <w:t>. https://doi.org/10.3389/fcosc.2021.653056</w:t>
+      </w:r>
+      <w:r>
+        <w:br/>
+      </w:r>
+      <w:proofErr w:type="spellStart"/>
+      <w:r>
+        <w:t>Juhola</w:t>
+      </w:r>
+      <w:proofErr w:type="spellEnd"/>
+      <w:r>
+        <w:t xml:space="preserve">, S., </w:t>
+      </w:r>
+      <w:proofErr w:type="spellStart"/>
+      <w:r>
+        <w:t>Huotari</w:t>
+      </w:r>
+      <w:proofErr w:type="spellEnd"/>
+      <w:r>
+        <w:t xml:space="preserve">, E., </w:t>
+      </w:r>
+      <w:proofErr w:type="spellStart"/>
+      <w:r>
+        <w:t>Kolehmainen</w:t>
+      </w:r>
+      <w:proofErr w:type="spellEnd"/>
+      <w:r>
+        <w:t>, L., Silfverberg, O., &amp; Korhonen-</w:t>
+      </w:r>
+      <w:proofErr w:type="spellStart"/>
+      <w:r>
+        <w:t>Kurki</w:t>
+      </w:r>
+      <w:proofErr w:type="spellEnd"/>
+      <w:r>
+        <w:t xml:space="preserve">, K. (2024). Knowledge brokering at the environmental science-policy interface - examining structure and activity. </w:t>
+      </w:r>
+      <w:r>
+        <w:rPr>
+          <w:i/>
+          <w:iCs/>
+        </w:rPr>
+        <w:t>Environmental Science &amp; Policy</w:t>
+      </w:r>
+      <w:r>
+        <w:t xml:space="preserve">, </w:t>
+      </w:r>
+      <w:r>
+        <w:rPr>
+          <w:i/>
+          <w:iCs/>
+        </w:rPr>
+        <w:t>153</w:t>
+      </w:r>
+      <w:r>
+        <w:t>. https://doi.org/10.1016/j.envsci.2024.103672</w:t>
+      </w:r>
+      <w:r>
+        <w:br/>
+      </w:r>
+      <w:r>
+        <w:lastRenderedPageBreak/>
+        <w:t>Karam-</w:t>
+      </w:r>
+      <w:proofErr w:type="spellStart"/>
+      <w:r>
+        <w:t>Gemael</w:t>
+      </w:r>
+      <w:proofErr w:type="spellEnd"/>
+      <w:r>
+        <w:t xml:space="preserve">, M., Loyola, R., Penha, J., &amp; Izzo, T. (2018). Poor alignment of priorities between scientists and policymakers highlights the need for evidence-informed conservation in Brazil. </w:t>
+      </w:r>
+      <w:r>
+        <w:rPr>
+          <w:i/>
+          <w:iCs/>
+        </w:rPr>
+        <w:t>Perspectives in Ecology and Conservation</w:t>
+      </w:r>
+      <w:r>
+        <w:t xml:space="preserve">, </w:t>
+      </w:r>
+      <w:r>
+        <w:rPr>
+          <w:i/>
+          <w:iCs/>
+        </w:rPr>
+        <w:t>16</w:t>
+      </w:r>
+      <w:r>
+        <w:t>(3), 125–132. https://doi.org/10.1016/j.pecon.2018.06.002</w:t>
+      </w:r>
+      <w:r>
+        <w:br/>
+      </w:r>
+      <w:proofErr w:type="spellStart"/>
+      <w:r>
+        <w:t>Karcher</w:t>
+      </w:r>
+      <w:proofErr w:type="spellEnd"/>
+      <w:r>
+        <w:t xml:space="preserve">, D. B., </w:t>
+      </w:r>
+      <w:proofErr w:type="spellStart"/>
+      <w:r>
+        <w:t>Cvitanovic</w:t>
+      </w:r>
+      <w:proofErr w:type="spellEnd"/>
+      <w:r>
+        <w:t xml:space="preserve">, C., Colvin, R. M., van </w:t>
+      </w:r>
+      <w:proofErr w:type="spellStart"/>
+      <w:r>
+        <w:t>Putten</w:t>
+      </w:r>
+      <w:proofErr w:type="spellEnd"/>
+      <w:r>
+        <w:t xml:space="preserve">, I., </w:t>
+      </w:r>
+      <w:proofErr w:type="spellStart"/>
+      <w:r>
+        <w:t>Pozza</w:t>
+      </w:r>
+      <w:proofErr w:type="spellEnd"/>
+      <w:r>
+        <w:t xml:space="preserve">, R. D., &amp; Posner, S. (2025). Key attributes for effective knowledge brokering at the interface of environmental science and management. </w:t>
+      </w:r>
+      <w:r>
+        <w:rPr>
+          <w:i/>
+          <w:iCs/>
+        </w:rPr>
+        <w:t>Sustainability Science</w:t>
+      </w:r>
+      <w:r>
+        <w:t xml:space="preserve">, </w:t>
+      </w:r>
+      <w:r>
+        <w:rPr>
+          <w:i/>
+          <w:iCs/>
+        </w:rPr>
+        <w:t>20</w:t>
+      </w:r>
+      <w:r>
+        <w:t>(1), 117–133. https://doi.org/10.1007/s11625-024-01575-6</w:t>
+      </w:r>
+      <w:r>
+        <w:br/>
+      </w:r>
+      <w:proofErr w:type="spellStart"/>
+      <w:r>
+        <w:t>Kartez</w:t>
+      </w:r>
+      <w:proofErr w:type="spellEnd"/>
+      <w:r>
+        <w:t xml:space="preserve">, J. D., &amp; </w:t>
+      </w:r>
+      <w:proofErr w:type="spellStart"/>
+      <w:r>
+        <w:t>Casto</w:t>
+      </w:r>
+      <w:proofErr w:type="spellEnd"/>
+      <w:r>
+        <w:t xml:space="preserve">, M. P. (2008). Information Into Action Biodiversity Data Outreach and Municipal Land Conservation. </w:t>
+      </w:r>
+      <w:r>
+        <w:rPr>
+          <w:i/>
+          <w:iCs/>
+        </w:rPr>
+        <w:t>Journal of the American Planning Association. American Planning Association</w:t>
+      </w:r>
+      <w:r>
+        <w:t xml:space="preserve">, </w:t>
+      </w:r>
+      <w:r>
+        <w:rPr>
+          <w:i/>
+          <w:iCs/>
+        </w:rPr>
+        <w:t>74</w:t>
+      </w:r>
+      <w:r>
+        <w:t>(4), 467–480. https://doi.org/10.1080/01944360802378096</w:t>
+      </w:r>
+      <w:r>
+        <w:br/>
+        <w:t xml:space="preserve">Koehn, J. D., Balcombe, S. R., &amp; </w:t>
+      </w:r>
+      <w:proofErr w:type="spellStart"/>
+      <w:r>
+        <w:t>Zampatti</w:t>
+      </w:r>
+      <w:proofErr w:type="spellEnd"/>
+      <w:r>
+        <w:t xml:space="preserve">, B. P. (2019). Fish and flow management in the Murray-Darling Basin: Directions for research. </w:t>
+      </w:r>
+      <w:r>
+        <w:rPr>
+          <w:i/>
+          <w:iCs/>
+        </w:rPr>
+        <w:t>Ecological Management &amp; Restoration</w:t>
+      </w:r>
+      <w:r>
+        <w:t xml:space="preserve">, </w:t>
+      </w:r>
+      <w:r>
+        <w:rPr>
+          <w:i/>
+          <w:iCs/>
+        </w:rPr>
+        <w:t>20</w:t>
+      </w:r>
+      <w:r>
+        <w:t>(2), 142–150. https://doi.org/10.1111/emr.12358</w:t>
+      </w:r>
+      <w:r>
+        <w:br/>
+        <w:t xml:space="preserve">Kuiper, T., Ngwenya, N., </w:t>
+      </w:r>
+      <w:proofErr w:type="spellStart"/>
+      <w:r>
+        <w:t>Kavhu</w:t>
+      </w:r>
+      <w:proofErr w:type="spellEnd"/>
+      <w:r>
+        <w:t xml:space="preserve">, B., </w:t>
+      </w:r>
+      <w:proofErr w:type="spellStart"/>
+      <w:r>
+        <w:t>Mandisodza-Chikerema</w:t>
+      </w:r>
+      <w:proofErr w:type="spellEnd"/>
+      <w:r>
+        <w:t xml:space="preserve">, R., &amp; Milner-Gulland, E. J. (2023). Making adaptive management more user friendly to encourage manager buy-in. </w:t>
+      </w:r>
+      <w:r>
+        <w:rPr>
+          <w:i/>
+          <w:iCs/>
+        </w:rPr>
+        <w:t>People and Nature</w:t>
+      </w:r>
+      <w:r>
+        <w:t xml:space="preserve">, </w:t>
+      </w:r>
+      <w:r>
+        <w:rPr>
+          <w:i/>
+          <w:iCs/>
+        </w:rPr>
+        <w:t>5</w:t>
+      </w:r>
+      <w:r>
+        <w:t>(2), 684–698. https://doi.org/10.1002/pan3.10440</w:t>
+      </w:r>
+      <w:r>
+        <w:br/>
+        <w:t xml:space="preserve">Lalor, B. M., &amp; Hickey, G. M. (2014). Strengthening the Role of Science in the Environmental Decision-Making Processes of Executive Government. </w:t>
+      </w:r>
+      <w:r>
+        <w:rPr>
+          <w:i/>
+          <w:iCs/>
+        </w:rPr>
+        <w:t>Organization &amp; Environment</w:t>
+      </w:r>
+      <w:r>
+        <w:t xml:space="preserve">, </w:t>
+      </w:r>
+      <w:r>
+        <w:rPr>
+          <w:i/>
+          <w:iCs/>
+        </w:rPr>
+        <w:t>27</w:t>
+      </w:r>
+      <w:r>
+        <w:t>(2), 161–180. https://doi.org/10.1177/1086026614525641</w:t>
+      </w:r>
+      <w:r>
+        <w:br/>
+        <w:t xml:space="preserve">Lapointe, N. W. R., Tremblay, M. A., &amp; </w:t>
+      </w:r>
+      <w:proofErr w:type="spellStart"/>
+      <w:r>
+        <w:t>Barna</w:t>
+      </w:r>
+      <w:proofErr w:type="spellEnd"/>
+      <w:r>
+        <w:t xml:space="preserve">, H. (2016). Tools for Improving the Effectiveness of Academic Partnerships in Informing Conservation Practices. </w:t>
+      </w:r>
+      <w:r>
+        <w:rPr>
+          <w:i/>
+          <w:iCs/>
+        </w:rPr>
+        <w:t>Natural Areas Journal</w:t>
+      </w:r>
+      <w:r>
+        <w:t xml:space="preserve">, </w:t>
+      </w:r>
+      <w:r>
+        <w:rPr>
+          <w:i/>
+          <w:iCs/>
+        </w:rPr>
+        <w:t>36</w:t>
+      </w:r>
+      <w:r>
+        <w:t>(1), 93–100. https://doi.org/10.3375/043.036.0116</w:t>
+      </w:r>
+      <w:r>
+        <w:br/>
+        <w:t xml:space="preserve">Lonsdale, J. A., Gill, A. B., </w:t>
+      </w:r>
+      <w:proofErr w:type="spellStart"/>
+      <w:r>
+        <w:t>Alliji</w:t>
+      </w:r>
+      <w:proofErr w:type="spellEnd"/>
+      <w:r>
+        <w:t xml:space="preserve">, K., </w:t>
+      </w:r>
+      <w:proofErr w:type="spellStart"/>
+      <w:r>
+        <w:t>Birchenough</w:t>
+      </w:r>
+      <w:proofErr w:type="spellEnd"/>
+      <w:r>
+        <w:t xml:space="preserve">, S. N. R., Blake, S., Buckley, H., Clarke, C., Clarke, S., Edmonds, N., Fonseca, L., </w:t>
+      </w:r>
+      <w:proofErr w:type="spellStart"/>
+      <w:r>
+        <w:t>Goodsir</w:t>
+      </w:r>
+      <w:proofErr w:type="spellEnd"/>
+      <w:r>
+        <w:t xml:space="preserve">, F., Griffith, A., Judd, A., Mulholland, R., Perry, J., Randall, K., &amp; Wood, D. (2022). It Is a Balancing Act: The Interface of Scientific Evidence and Policy in Support of Effective Marine Environmental Management. </w:t>
+      </w:r>
+      <w:r>
+        <w:rPr>
+          <w:i/>
+          <w:iCs/>
+        </w:rPr>
+        <w:t>Sustainability</w:t>
+      </w:r>
+      <w:r>
+        <w:t xml:space="preserve">, </w:t>
+      </w:r>
+      <w:r>
+        <w:rPr>
+          <w:i/>
+          <w:iCs/>
+        </w:rPr>
+        <w:t>14</w:t>
+      </w:r>
+      <w:r>
+        <w:t>(3). https://doi.org/10.3390/su14031650</w:t>
+      </w:r>
+      <w:r>
+        <w:br/>
+      </w:r>
+      <w:proofErr w:type="spellStart"/>
+      <w:r>
+        <w:lastRenderedPageBreak/>
+        <w:t>McConney</w:t>
+      </w:r>
+      <w:proofErr w:type="spellEnd"/>
+      <w:r>
+        <w:t xml:space="preserve">, P., Fanning, L., Mahon, R., &amp; Simmons, B. (2016). A first look at the science-policy interface for ocean governance in the Wider Caribbean Region. </w:t>
+      </w:r>
+      <w:r>
+        <w:rPr>
+          <w:i/>
+          <w:iCs/>
+        </w:rPr>
+        <w:t>Frontiers in Marine Science</w:t>
+      </w:r>
+      <w:r>
+        <w:t xml:space="preserve">, </w:t>
+      </w:r>
+      <w:r>
+        <w:rPr>
+          <w:i/>
+          <w:iCs/>
+        </w:rPr>
+        <w:t>2</w:t>
+      </w:r>
+      <w:r>
+        <w:t>. https://doi.org/10.3389/fmars.2015.00119</w:t>
+      </w:r>
+      <w:r>
+        <w:br/>
+        <w:t xml:space="preserve">Messmer, T. A., </w:t>
+      </w:r>
+      <w:proofErr w:type="spellStart"/>
+      <w:r>
+        <w:t>Hasenyager</w:t>
+      </w:r>
+      <w:proofErr w:type="spellEnd"/>
+      <w:r>
+        <w:t xml:space="preserve">, R., </w:t>
+      </w:r>
+      <w:proofErr w:type="spellStart"/>
+      <w:r>
+        <w:t>Burruss</w:t>
+      </w:r>
+      <w:proofErr w:type="spellEnd"/>
+      <w:r>
+        <w:t xml:space="preserve">, J., &amp; Liguori, S. (2013). Stakeholder contemporary knowledge needs regarding the potential effects of tall structures on sage-grouse. </w:t>
+      </w:r>
+      <w:r>
+        <w:rPr>
+          <w:i/>
+          <w:iCs/>
+        </w:rPr>
+        <w:t>Human-Wildlife Interactions</w:t>
+      </w:r>
+      <w:r>
+        <w:t xml:space="preserve">, </w:t>
+      </w:r>
+      <w:r>
+        <w:rPr>
+          <w:i/>
+          <w:iCs/>
+        </w:rPr>
+        <w:t>7</w:t>
+      </w:r>
+      <w:r>
+        <w:t>(2), 273–298.</w:t>
+      </w:r>
+      <w:r>
+        <w:br/>
+        <w:t xml:space="preserve">Murray, G., Randall, C., &amp; Rollins, R. (2020). Informing Protected Area Decision Making through Academic-Practitioner Collaborations. </w:t>
+      </w:r>
+      <w:r>
+        <w:rPr>
+          <w:i/>
+          <w:iCs/>
+        </w:rPr>
+        <w:t>The Land</w:t>
+      </w:r>
+      <w:r>
+        <w:t xml:space="preserve">, </w:t>
+      </w:r>
+      <w:r>
+        <w:rPr>
+          <w:i/>
+          <w:iCs/>
+        </w:rPr>
+        <w:t>9</w:t>
+      </w:r>
+      <w:r>
+        <w:t>(10). https://doi.org/10.3390/land9100375</w:t>
+      </w:r>
+      <w:r>
+        <w:br/>
+      </w:r>
+      <w:proofErr w:type="spellStart"/>
+      <w:r>
+        <w:t>Neeff</w:t>
+      </w:r>
+      <w:proofErr w:type="spellEnd"/>
+      <w:r>
+        <w:t xml:space="preserve">, T., &amp; Piazza, M. (2020). How countries link forest monitoring into policy-making. </w:t>
+      </w:r>
+      <w:r>
+        <w:rPr>
+          <w:i/>
+          <w:iCs/>
+        </w:rPr>
+        <w:t>Forest Policy and Economics</w:t>
+      </w:r>
+      <w:r>
+        <w:t xml:space="preserve">, </w:t>
+      </w:r>
+      <w:r>
+        <w:rPr>
+          <w:i/>
+          <w:iCs/>
+        </w:rPr>
+        <w:t>118</w:t>
+      </w:r>
+      <w:r>
+        <w:t>. https://doi.org/10.1016/j.forpol.2020.102248</w:t>
+      </w:r>
+      <w:r>
+        <w:br/>
+        <w:t xml:space="preserve">Ormerod, S. J., Barlow, N. D., Marshall, E. J. P., &amp; Kerby, G. (2002). The uptake of applied ecology. </w:t>
+      </w:r>
+      <w:r>
+        <w:rPr>
+          <w:i/>
+          <w:iCs/>
+        </w:rPr>
+        <w:t>The Journal of Applied Ecology</w:t>
+      </w:r>
+      <w:r>
+        <w:t xml:space="preserve">, </w:t>
+      </w:r>
+      <w:r>
+        <w:rPr>
+          <w:i/>
+          <w:iCs/>
+        </w:rPr>
+        <w:t>39</w:t>
+      </w:r>
+      <w:r>
+        <w:t>(1), 46204. https://doi.org/10.1046/j.0021-8901.2001.00705.x</w:t>
+      </w:r>
+      <w:r>
+        <w:br/>
+        <w:t xml:space="preserve">Pelletier, D. (2020). Assessing the Effectiveness of Coastal Marine Protected Area Management: Four Learned Lessons for Science Uptake and Upscaling. </w:t>
+      </w:r>
+      <w:r>
+        <w:rPr>
+          <w:i/>
+          <w:iCs/>
+        </w:rPr>
+        <w:t>Frontiers in Marine Science</w:t>
+      </w:r>
+      <w:r>
+        <w:t xml:space="preserve">, </w:t>
+      </w:r>
+      <w:r>
+        <w:rPr>
+          <w:i/>
+          <w:iCs/>
+        </w:rPr>
+        <w:t>7</w:t>
+      </w:r>
+      <w:r>
+        <w:t>. https://doi.org/10.3389/fmars.2020.545930</w:t>
+      </w:r>
+      <w:r>
+        <w:br/>
+      </w:r>
+      <w:proofErr w:type="spellStart"/>
+      <w:r>
+        <w:t>Petheram</w:t>
+      </w:r>
+      <w:proofErr w:type="spellEnd"/>
+      <w:r>
+        <w:t xml:space="preserve">, L., Stacey, N., Campbell, B. M., &amp; High, C. (2012). Using visual products derived from community research to inform natural resource management policy. </w:t>
+      </w:r>
+      <w:r>
+        <w:rPr>
+          <w:i/>
+          <w:iCs/>
+        </w:rPr>
+        <w:t>Land Use Policy</w:t>
+      </w:r>
+      <w:r>
+        <w:t xml:space="preserve">, </w:t>
+      </w:r>
+      <w:r>
+        <w:rPr>
+          <w:i/>
+          <w:iCs/>
+        </w:rPr>
+        <w:t>29</w:t>
+      </w:r>
+      <w:r>
+        <w:t>(1), 46296. https://doi.org/10.1016/j.landusepol.2011.04.002</w:t>
+      </w:r>
+      <w:r>
+        <w:br/>
+      </w:r>
+      <w:proofErr w:type="spellStart"/>
+      <w:r>
+        <w:t>Pfaeffle</w:t>
+      </w:r>
+      <w:proofErr w:type="spellEnd"/>
+      <w:r>
+        <w:t xml:space="preserve">, T., Moore, M. A., Cravens, A. E., McEvoy, J., &amp; Bamzai-Dodson, A. (2022). Murky waters: divergent ways scientists, practitioners, and landowners evaluate beaver mimicry. </w:t>
+      </w:r>
+      <w:r>
+        <w:rPr>
+          <w:i/>
+          <w:iCs/>
+        </w:rPr>
+        <w:t>ECOLOGY AND SOCIETY</w:t>
+      </w:r>
+      <w:r>
+        <w:t xml:space="preserve">, </w:t>
+      </w:r>
+      <w:r>
+        <w:rPr>
+          <w:i/>
+          <w:iCs/>
+        </w:rPr>
+        <w:t>27</w:t>
+      </w:r>
+      <w:r>
+        <w:t>(1). https://doi.org/10.5751/ES-13006-270141</w:t>
+      </w:r>
+      <w:r>
+        <w:br/>
+      </w:r>
+      <w:proofErr w:type="spellStart"/>
+      <w:r>
+        <w:t>Polejack</w:t>
+      </w:r>
+      <w:proofErr w:type="spellEnd"/>
+      <w:r>
+        <w:t xml:space="preserve">, A., Ramírez-Monsalve, P., &amp; </w:t>
+      </w:r>
+      <w:proofErr w:type="spellStart"/>
+      <w:r>
+        <w:t>Wisz</w:t>
+      </w:r>
+      <w:proofErr w:type="spellEnd"/>
+      <w:r>
+        <w:t xml:space="preserve">, M. S. (2023). What does </w:t>
+      </w:r>
+      <w:proofErr w:type="gramStart"/>
+      <w:r>
+        <w:t>integrated</w:t>
+      </w:r>
+      <w:proofErr w:type="gramEnd"/>
+      <w:r>
+        <w:t xml:space="preserve"> ecosystem assessment mean to policy-makers and scientists working in the Atlantic? Implications for ocean science diplomacy. </w:t>
+      </w:r>
+      <w:r>
+        <w:rPr>
+          <w:i/>
+          <w:iCs/>
+        </w:rPr>
+        <w:t>Frontiers in Marine Science</w:t>
+      </w:r>
+      <w:r>
+        <w:t xml:space="preserve">, </w:t>
+      </w:r>
+      <w:r>
+        <w:rPr>
+          <w:i/>
+          <w:iCs/>
+        </w:rPr>
+        <w:t>10</w:t>
+      </w:r>
+      <w:r>
+        <w:t>. https://doi.org/10.3389/fmars.2023.1004740</w:t>
+      </w:r>
+      <w:r>
+        <w:br/>
+        <w:t xml:space="preserve">Ramirez, L. F., &amp; Belcher, B. M. (2019). Stakeholder perceptions of scientific knowledge in </w:t>
+      </w:r>
+      <w:r>
+        <w:lastRenderedPageBreak/>
+        <w:t xml:space="preserve">policy processes: A Peruvian case-study of forestry policy development. </w:t>
+      </w:r>
+      <w:r>
+        <w:rPr>
+          <w:i/>
+          <w:iCs/>
+        </w:rPr>
+        <w:t>Science &amp; Public Policy</w:t>
+      </w:r>
+      <w:r>
+        <w:t xml:space="preserve">, </w:t>
+      </w:r>
+      <w:r>
+        <w:rPr>
+          <w:i/>
+          <w:iCs/>
+        </w:rPr>
+        <w:t>46</w:t>
+      </w:r>
+      <w:r>
+        <w:t>(4), 504–517. https://doi.org/10.1093/scipol/scz003</w:t>
+      </w:r>
+      <w:r>
+        <w:br/>
+        <w:t xml:space="preserve">Rittenhouse, J., </w:t>
+      </w:r>
+      <w:proofErr w:type="spellStart"/>
+      <w:r>
+        <w:t>Leites</w:t>
+      </w:r>
+      <w:proofErr w:type="spellEnd"/>
+      <w:r>
+        <w:t xml:space="preserve">, L., </w:t>
+      </w:r>
+      <w:proofErr w:type="spellStart"/>
+      <w:r>
+        <w:t>Derham</w:t>
+      </w:r>
+      <w:proofErr w:type="spellEnd"/>
+      <w:r>
+        <w:t xml:space="preserve">, K., &amp; Miller, S. (2018). Insights on the use of decision-support tools to sustain forest ecosystems from a case study in Pennsylvania, USA. </w:t>
+      </w:r>
+      <w:r>
+        <w:rPr>
+          <w:i/>
+          <w:iCs/>
+        </w:rPr>
+        <w:t>Journal of Forestry</w:t>
+      </w:r>
+      <w:r>
+        <w:t xml:space="preserve">, </w:t>
+      </w:r>
+      <w:r>
+        <w:rPr>
+          <w:i/>
+          <w:iCs/>
+        </w:rPr>
+        <w:t>116</w:t>
+      </w:r>
+      <w:r>
+        <w:t>(4), 391–395. https://doi.org/10.1093/jofore/fvy016</w:t>
+      </w:r>
+      <w:r>
+        <w:br/>
+      </w:r>
+      <w:proofErr w:type="spellStart"/>
+      <w:r>
+        <w:t>Siggery</w:t>
+      </w:r>
+      <w:proofErr w:type="spellEnd"/>
+      <w:r>
+        <w:t xml:space="preserve">, B., </w:t>
+      </w:r>
+      <w:proofErr w:type="spellStart"/>
+      <w:r>
+        <w:t>Bennion</w:t>
+      </w:r>
+      <w:proofErr w:type="spellEnd"/>
+      <w:r>
+        <w:t xml:space="preserve">, H., Morse, S., Murphy, R., &amp; Waite, M. (2023). Practitioner perspectives on the application of palaeoecology in nature conservation. </w:t>
+      </w:r>
+      <w:r>
+        <w:rPr>
+          <w:i/>
+          <w:iCs/>
+        </w:rPr>
+        <w:t>Frontiers in Ecology and Evolution</w:t>
+      </w:r>
+      <w:r>
+        <w:t xml:space="preserve">, </w:t>
+      </w:r>
+      <w:r>
+        <w:rPr>
+          <w:i/>
+          <w:iCs/>
+        </w:rPr>
+        <w:t>11</w:t>
+      </w:r>
+      <w:r>
+        <w:t>. https://doi.org/10.3389/fevo.2023.1304510</w:t>
+      </w:r>
+      <w:r>
+        <w:br/>
+        <w:t xml:space="preserve">Stevens, M., &amp; Norris, D. R. (2022). A mixed methodology for evaluating use of evidence in conservation planning. </w:t>
+      </w:r>
+      <w:r>
+        <w:rPr>
+          <w:i/>
+          <w:iCs/>
+        </w:rPr>
+        <w:t>Conservation Biology</w:t>
+      </w:r>
+      <w:r>
+        <w:t xml:space="preserve">, </w:t>
+      </w:r>
+      <w:r>
+        <w:rPr>
+          <w:i/>
+          <w:iCs/>
+        </w:rPr>
+        <w:t>36</w:t>
+      </w:r>
+      <w:r>
+        <w:t>(4). https://doi.org/10.1111/cobi.13876</w:t>
+      </w:r>
+      <w:r>
+        <w:br/>
+        <w:t xml:space="preserve">Tambe, S., Rawat, G. S., Bhutia, N. T., Sherpa, P. N., </w:t>
+      </w:r>
+      <w:proofErr w:type="spellStart"/>
+      <w:r>
+        <w:t>Dhakal</w:t>
+      </w:r>
+      <w:proofErr w:type="spellEnd"/>
+      <w:r>
+        <w:t xml:space="preserve">, S., Pradhan, S., Kulkarni, H., &amp; </w:t>
+      </w:r>
+      <w:proofErr w:type="spellStart"/>
+      <w:r>
+        <w:t>Arrawatia</w:t>
+      </w:r>
+      <w:proofErr w:type="spellEnd"/>
+      <w:r>
+        <w:t xml:space="preserve">, M. L. (2020). Building sustainability in the Eastern Himalaya: linking evidence to action. </w:t>
+      </w:r>
+      <w:proofErr w:type="spellStart"/>
+      <w:r>
+        <w:rPr>
+          <w:i/>
+          <w:iCs/>
+          <w:lang w:val="es-ES"/>
+        </w:rPr>
+        <w:t>Environment</w:t>
+      </w:r>
+      <w:proofErr w:type="spellEnd"/>
+      <w:r>
+        <w:rPr>
+          <w:i/>
+          <w:iCs/>
+          <w:lang w:val="es-ES"/>
+        </w:rPr>
+        <w:t xml:space="preserve"> </w:t>
+      </w:r>
+      <w:proofErr w:type="spellStart"/>
+      <w:r>
+        <w:rPr>
+          <w:i/>
+          <w:iCs/>
+          <w:lang w:val="es-ES"/>
+        </w:rPr>
+        <w:t>Development</w:t>
+      </w:r>
+      <w:proofErr w:type="spellEnd"/>
+      <w:r>
+        <w:rPr>
+          <w:i/>
+          <w:iCs/>
+          <w:lang w:val="es-ES"/>
+        </w:rPr>
+        <w:t xml:space="preserve"> and </w:t>
+      </w:r>
+      <w:proofErr w:type="spellStart"/>
+      <w:r>
+        <w:rPr>
+          <w:i/>
+          <w:iCs/>
+          <w:lang w:val="es-ES"/>
+        </w:rPr>
+        <w:t>Sustainability</w:t>
+      </w:r>
+      <w:proofErr w:type="spellEnd"/>
+      <w:r>
+        <w:rPr>
+          <w:lang w:val="es-ES"/>
+        </w:rPr>
+        <w:t xml:space="preserve">, </w:t>
+      </w:r>
+      <w:r>
+        <w:rPr>
+          <w:i/>
+          <w:iCs/>
+          <w:lang w:val="es-ES"/>
+        </w:rPr>
+        <w:t>22</w:t>
+      </w:r>
+      <w:r>
+        <w:rPr>
+          <w:lang w:val="es-ES"/>
+        </w:rPr>
+        <w:t>(6), 5887–5903. https://doi.org/10.1007/s10668-019-00456-8</w:t>
+      </w:r>
+      <w:r>
+        <w:rPr>
+          <w:lang w:val="es-ES"/>
+        </w:rPr>
+        <w:br/>
+        <w:t xml:space="preserve">Valdez, J. W., Pereira, H. M., Morejón, G. F., Acosta-Muñoz, C., Bonet </w:t>
+      </w:r>
+      <w:proofErr w:type="spellStart"/>
+      <w:r>
+        <w:rPr>
+          <w:lang w:val="es-ES"/>
+        </w:rPr>
+        <w:t>Garcia</w:t>
+      </w:r>
+      <w:proofErr w:type="spellEnd"/>
+      <w:r>
+        <w:rPr>
+          <w:lang w:val="es-ES"/>
+        </w:rPr>
+        <w:t xml:space="preserve">, F. J., Castro Vergara, L., Claros, X. R., Gill, M. J., </w:t>
+      </w:r>
+      <w:proofErr w:type="spellStart"/>
+      <w:r>
+        <w:rPr>
+          <w:lang w:val="es-ES"/>
+        </w:rPr>
+        <w:t>Josse</w:t>
+      </w:r>
+      <w:proofErr w:type="spellEnd"/>
+      <w:r>
+        <w:rPr>
+          <w:lang w:val="es-ES"/>
+        </w:rPr>
+        <w:t xml:space="preserve">, C., Lafuente-Cartagena, I., </w:t>
+      </w:r>
+      <w:proofErr w:type="spellStart"/>
+      <w:r>
+        <w:rPr>
+          <w:lang w:val="es-ES"/>
+        </w:rPr>
+        <w:t>Langstroth</w:t>
+      </w:r>
+      <w:proofErr w:type="spellEnd"/>
+      <w:r>
+        <w:rPr>
+          <w:lang w:val="es-ES"/>
+        </w:rPr>
+        <w:t xml:space="preserve">, R., Sheppard, S. N., Orihuela, G., Prieto-Albuja, F. J., </w:t>
+      </w:r>
+      <w:proofErr w:type="spellStart"/>
+      <w:r>
+        <w:rPr>
+          <w:lang w:val="es-ES"/>
+        </w:rPr>
+        <w:t>Quillahuaman</w:t>
+      </w:r>
+      <w:proofErr w:type="spellEnd"/>
+      <w:r>
+        <w:rPr>
+          <w:lang w:val="es-ES"/>
+        </w:rPr>
+        <w:t>, N., Terán, M. F., Zambrana-</w:t>
+      </w:r>
+      <w:proofErr w:type="spellStart"/>
+      <w:r>
+        <w:rPr>
+          <w:lang w:val="es-ES"/>
+        </w:rPr>
+        <w:t>Torrelio</w:t>
+      </w:r>
+      <w:proofErr w:type="spellEnd"/>
+      <w:r>
+        <w:rPr>
+          <w:lang w:val="es-ES"/>
+        </w:rPr>
+        <w:t xml:space="preserve">, C. M., Navarro, L. M., &amp; </w:t>
+      </w:r>
+      <w:proofErr w:type="spellStart"/>
+      <w:r>
+        <w:rPr>
+          <w:lang w:val="es-ES"/>
+        </w:rPr>
+        <w:t>Fernandez</w:t>
+      </w:r>
+      <w:proofErr w:type="spellEnd"/>
+      <w:r>
+        <w:rPr>
+          <w:lang w:val="es-ES"/>
+        </w:rPr>
+        <w:t xml:space="preserve">, M. (2023). </w:t>
+      </w:r>
+      <w:r>
+        <w:t xml:space="preserve">Tailoring evidence into action: Using a co-design approach for biodiversity information in the Tropical Andes. </w:t>
+      </w:r>
+      <w:r>
+        <w:rPr>
+          <w:i/>
+          <w:iCs/>
+        </w:rPr>
+        <w:t>Conservation Science and Practice</w:t>
+      </w:r>
+      <w:r>
+        <w:t xml:space="preserve">, </w:t>
+      </w:r>
+      <w:r>
+        <w:rPr>
+          <w:i/>
+          <w:iCs/>
+        </w:rPr>
+        <w:t>5</w:t>
+      </w:r>
+      <w:r>
+        <w:t>(12). https://doi.org/10.1111/csp2.13035</w:t>
+      </w:r>
+      <w:r>
+        <w:br/>
+        <w:t xml:space="preserve">Vimal, R., </w:t>
+      </w:r>
+      <w:proofErr w:type="spellStart"/>
+      <w:r>
+        <w:t>Gatiso</w:t>
+      </w:r>
+      <w:proofErr w:type="spellEnd"/>
+      <w:r>
+        <w:t xml:space="preserve">, T., &amp; </w:t>
+      </w:r>
+      <w:proofErr w:type="spellStart"/>
+      <w:r>
+        <w:t>Mathevet</w:t>
+      </w:r>
+      <w:proofErr w:type="spellEnd"/>
+      <w:r>
+        <w:t xml:space="preserve">, R. (2018). Monitoring in Tropical National Parks: The Power of Knowledge. </w:t>
+      </w:r>
+      <w:r>
+        <w:rPr>
+          <w:i/>
+          <w:iCs/>
+        </w:rPr>
+        <w:t>Conservation &amp; Society</w:t>
+      </w:r>
+      <w:r>
+        <w:t xml:space="preserve">, </w:t>
+      </w:r>
+      <w:r>
+        <w:rPr>
+          <w:i/>
+          <w:iCs/>
+        </w:rPr>
+        <w:t>16</w:t>
+      </w:r>
+      <w:r>
+        <w:t>(1), 76–90. https://doi.org/10.4103/cs.cs_17_12</w:t>
+      </w:r>
+      <w:r>
+        <w:br/>
+        <w:t xml:space="preserve">Young, K. D., &amp; Van </w:t>
+      </w:r>
+      <w:proofErr w:type="spellStart"/>
+      <w:r>
+        <w:t>Aarde</w:t>
+      </w:r>
+      <w:proofErr w:type="spellEnd"/>
+      <w:r>
+        <w:t xml:space="preserve">, R. J. (2011). Science and elephant management decisions in South Africa. </w:t>
+      </w:r>
+      <w:r>
+        <w:rPr>
+          <w:i/>
+          <w:iCs/>
+        </w:rPr>
+        <w:t>Biological Conservation</w:t>
+      </w:r>
+      <w:r>
+        <w:t xml:space="preserve">, </w:t>
+      </w:r>
+      <w:r>
+        <w:rPr>
+          <w:i/>
+          <w:iCs/>
+        </w:rPr>
+        <w:t>144</w:t>
+      </w:r>
+      <w:r>
+        <w:t>(2), 876–885. https://doi.org/10.1016/j.biocon.2010.11.023</w:t>
+      </w:r>
+      <w:r>
+        <w:br/>
+      </w:r>
+      <w:proofErr w:type="spellStart"/>
+      <w:r>
+        <w:t>Zavaleta</w:t>
+      </w:r>
+      <w:proofErr w:type="spellEnd"/>
+      <w:r>
+        <w:t xml:space="preserve">, E., Miller, D. C., </w:t>
+      </w:r>
+      <w:proofErr w:type="spellStart"/>
+      <w:r>
+        <w:t>Salafsky</w:t>
+      </w:r>
+      <w:proofErr w:type="spellEnd"/>
+      <w:r>
+        <w:t xml:space="preserve">, N., Fleishman, E., Webster, M., Gold, B., Hulse, D., Rowen, M., Tabor, G., &amp; </w:t>
+      </w:r>
+      <w:proofErr w:type="spellStart"/>
+      <w:r>
+        <w:t>Vanderryn</w:t>
+      </w:r>
+      <w:proofErr w:type="spellEnd"/>
+      <w:r>
+        <w:t xml:space="preserve">, J. (2008). Enhancing the engagement of U.S. private </w:t>
+      </w:r>
+      <w:r>
+        <w:lastRenderedPageBreak/>
+        <w:t xml:space="preserve">foundations with conservation science. </w:t>
+      </w:r>
+      <w:r>
+        <w:rPr>
+          <w:i/>
+          <w:iCs/>
+        </w:rPr>
+        <w:t>Conservation Biology</w:t>
+      </w:r>
+      <w:r>
+        <w:t xml:space="preserve">, </w:t>
+      </w:r>
+      <w:r>
+        <w:rPr>
+          <w:i/>
+          <w:iCs/>
+        </w:rPr>
+        <w:t>22</w:t>
+      </w:r>
+      <w:r>
+        <w:t>(6), 1477–1484. https://doi.org/10.1111/j.1523-1739.2008.01046.x</w:t>
+      </w:r>
+    </w:p>
+    <w:p>
+      <w:pPr>
+        <w:widowControl w:val="0"/>
+        <w:pBdr>
+          <w:top w:val="nil"/>
+          <w:left w:val="nil"/>
+          <w:bottom w:val="nil"/>
+          <w:right w:val="nil"/>
+          <w:between w:val="nil"/>
+        </w:pBdr>
+        <w:spacing w:line="480" w:lineRule="auto"/>
+        <w:rPr>
+          <w:b/>
+          <w:bCs/>
+        </w:rPr>
+      </w:pPr>
+    </w:p>
     <w:sectPr>
       <w:pgSz w:w="11909" w:h="16834"/>
       <w:pgMar w:top="1440" w:right="1440" w:bottom="1440" w:left="1440" w:header="720" w:footer="720" w:gutter="0"/>

</xml_diff>